<commit_message>
Implement receipt stages 1 and 2 logic
</commit_message>
<xml_diff>
--- a/Черновик ТЗ - система учета оборудования.docx
+++ b/Черновик ТЗ - система учета оборудования.docx
@@ -255,7 +255,7 @@
         <w:pStyle w:val="Heading2"/>
       </w:pPr>
       <w:r>
-        <w:t>5.1. Оператор (полевой сотрудник)</w:t>
+        <w:t>5.1. Оператор</w:t>
       </w:r>
     </w:p>
     <w:p>
@@ -527,7 +527,7 @@
         <w:pStyle w:val="ListNumber"/>
       </w:pPr>
       <w:r>
-        <w:t>Оператор вправе корректировать серийные номера и другие поля, но такие изменения должны сохраняться как отдельные события без удаления предыдущей истории.</w:t>
+        <w:t>Диспетчер вправе корректировать серийные номера и другие поля, но такие изменения должны сохраняться как отдельные события без удаления предыдущей истории.</w:t>
       </w:r>
     </w:p>
     <w:p>
@@ -1577,7 +1577,673 @@
         <w:pStyle w:val="Heading1"/>
       </w:pPr>
       <w:r>
-        <w:t>20. Используемые инструменты и обоснование выбора</w:t>
+        <w:t>20. Ключевые экраны текущей версии системы</w:t>
+      </w:r>
+    </w:p>
+    <w:p>
+      <w:r>
+        <w:t>На момент подготовки настоящего ТЗ в системе уже реализован базовый набор ключевых экранов и маршрутов. Ниже приведены экраны, которые уже учтены в архитектуре и должны оставаться ориентиром при дальнейшем развитии интерфейса.</w:t>
+      </w:r>
+    </w:p>
+    <w:p>
+      <w:pPr>
+        <w:pStyle w:val="Heading2"/>
+      </w:pPr>
+      <w:r>
+        <w:t>20.1. Экран авторизации</w:t>
+      </w:r>
+    </w:p>
+    <w:p>
+      <w:pPr>
+        <w:pStyle w:val="ListBullet"/>
+      </w:pPr>
+      <w:r>
+        <w:t>Поля ввода логина и пароля.</w:t>
+      </w:r>
+    </w:p>
+    <w:p>
+      <w:pPr>
+        <w:pStyle w:val="ListBullet"/>
+      </w:pPr>
+      <w:r>
+        <w:t>Кнопка входа в систему.</w:t>
+      </w:r>
+    </w:p>
+    <w:p>
+      <w:pPr>
+        <w:pStyle w:val="ListBullet"/>
+      </w:pPr>
+      <w:r>
+        <w:t>Показ и скрытие пароля.</w:t>
+      </w:r>
+    </w:p>
+    <w:p>
+      <w:pPr>
+        <w:pStyle w:val="ListBullet"/>
+      </w:pPr>
+      <w:r>
+        <w:t>Валидация обязательных полей и отображение сообщений об ошибках.</w:t>
+      </w:r>
+    </w:p>
+    <w:p>
+      <w:pPr>
+        <w:pStyle w:val="ListBullet"/>
+      </w:pPr>
+      <w:r>
+        <w:t>Перенаправление в интерфейс, соответствующий роли пользователя.</w:t>
+      </w:r>
+    </w:p>
+    <w:p>
+      <w:pPr>
+        <w:pStyle w:val="Heading2"/>
+      </w:pPr>
+      <w:r>
+        <w:t>20.2. Личный кабинет и профиль пользователя</w:t>
+      </w:r>
+    </w:p>
+    <w:p>
+      <w:pPr>
+        <w:pStyle w:val="ListBullet"/>
+      </w:pPr>
+      <w:r>
+        <w:t>Отображение ФИО, аватара, контактных данных и роли.</w:t>
+      </w:r>
+    </w:p>
+    <w:p>
+      <w:pPr>
+        <w:pStyle w:val="ListBullet"/>
+      </w:pPr>
+      <w:r>
+        <w:t>Редактирование собственного профиля.</w:t>
+      </w:r>
+    </w:p>
+    <w:p>
+      <w:pPr>
+        <w:pStyle w:val="ListBullet"/>
+      </w:pPr>
+      <w:r>
+        <w:t>Замена фотографии или аватара.</w:t>
+      </w:r>
+    </w:p>
+    <w:p>
+      <w:pPr>
+        <w:pStyle w:val="ListBullet"/>
+      </w:pPr>
+      <w:r>
+        <w:t>Просмотр текущей роли и доступных разделов системы.</w:t>
+      </w:r>
+    </w:p>
+    <w:p>
+      <w:pPr>
+        <w:pStyle w:val="Heading2"/>
+      </w:pPr>
+      <w:r>
+        <w:t>20.3. Полевой мобильный экран PWA</w:t>
+      </w:r>
+    </w:p>
+    <w:p>
+      <w:pPr>
+        <w:pStyle w:val="ListBullet"/>
+      </w:pPr>
+      <w:r>
+        <w:t>Список назначенных помещений с каскадными фильтрами по этажу, отделению и помещению.</w:t>
+      </w:r>
+    </w:p>
+    <w:p>
+      <w:pPr>
+        <w:pStyle w:val="ListBullet"/>
+      </w:pPr>
+      <w:r>
+        <w:t>Цветовая индикация статуса помещения: не начато, в работе, завершено, повторная проверка.</w:t>
+      </w:r>
+    </w:p>
+    <w:p>
+      <w:pPr>
+        <w:pStyle w:val="ListBullet"/>
+      </w:pPr>
+      <w:r>
+        <w:t>Карточка помещения со списком экземпляров оборудования.</w:t>
+      </w:r>
+    </w:p>
+    <w:p>
+      <w:pPr>
+        <w:pStyle w:val="ListBullet"/>
+      </w:pPr>
+      <w:r>
+        <w:t>Форма отметки по экземпляру: наличие, серийный номер или значение 'не предусмотрен', ПНР, коммуникации, комментарий.</w:t>
+      </w:r>
+    </w:p>
+    <w:p>
+      <w:pPr>
+        <w:pStyle w:val="ListBullet"/>
+      </w:pPr>
+      <w:r>
+        <w:t>Локальная очередь синхронизации и индикация online/offline-состояния.</w:t>
+      </w:r>
+    </w:p>
+    <w:p>
+      <w:pPr>
+        <w:pStyle w:val="Heading2"/>
+      </w:pPr>
+      <w:r>
+        <w:t>20.4. Операторская панель: вкладка 'Контроль'</w:t>
+      </w:r>
+    </w:p>
+    <w:p>
+      <w:pPr>
+        <w:pStyle w:val="ListBullet"/>
+      </w:pPr>
+      <w:r>
+        <w:t>Блок активной версии плана.</w:t>
+      </w:r>
+    </w:p>
+    <w:p>
+      <w:pPr>
+        <w:pStyle w:val="ListBullet"/>
+      </w:pPr>
+      <w:r>
+        <w:t>Сводка по помещениям и экземплярам.</w:t>
+      </w:r>
+    </w:p>
+    <w:p>
+      <w:pPr>
+        <w:pStyle w:val="ListBullet"/>
+      </w:pPr>
+      <w:r>
+        <w:t>Графики прогресса по помещениям, экземплярам и закрытию помещений по дням и сотрудникам.</w:t>
+      </w:r>
+    </w:p>
+    <w:p>
+      <w:pPr>
+        <w:pStyle w:val="ListBullet"/>
+      </w:pPr>
+      <w:r>
+        <w:t>Блок 'Рабочие помещения' с фильтрами и карточками помещений.</w:t>
+      </w:r>
+    </w:p>
+    <w:p>
+      <w:pPr>
+        <w:pStyle w:val="ListBullet"/>
+      </w:pPr>
+      <w:r>
+        <w:t>Блок 'Проблемные экземпляры' с фильтрами по этажу, отделению, помещению и типу проблемы.</w:t>
+      </w:r>
+    </w:p>
+    <w:p>
+      <w:pPr>
+        <w:pStyle w:val="Heading2"/>
+      </w:pPr>
+      <w:r>
+        <w:t>20.5. Операторская панель: вкладка 'Сотрудники'</w:t>
+      </w:r>
+    </w:p>
+    <w:p>
+      <w:pPr>
+        <w:pStyle w:val="ListBullet"/>
+      </w:pPr>
+      <w:r>
+        <w:t>Список активных сотрудников в виде карточек.</w:t>
+      </w:r>
+    </w:p>
+    <w:p>
+      <w:pPr>
+        <w:pStyle w:val="ListBullet"/>
+      </w:pPr>
+      <w:r>
+        <w:t>Отдельный свернутый блок неактивных сотрудников.</w:t>
+      </w:r>
+    </w:p>
+    <w:p>
+      <w:pPr>
+        <w:pStyle w:val="ListBullet"/>
+      </w:pPr>
+      <w:r>
+        <w:t>Форма создания нового сотрудника с валидацией полей и загрузкой фото.</w:t>
+      </w:r>
+    </w:p>
+    <w:p>
+      <w:pPr>
+        <w:pStyle w:val="ListBullet"/>
+      </w:pPr>
+      <w:r>
+        <w:t>Всплывающее окно редактирования сотрудника.</w:t>
+      </w:r>
+    </w:p>
+    <w:p>
+      <w:pPr>
+        <w:pStyle w:val="ListBullet"/>
+      </w:pPr>
+      <w:r>
+        <w:t>Управление ролями: оператор, диспетчер, супервайзер.</w:t>
+      </w:r>
+    </w:p>
+    <w:p>
+      <w:pPr>
+        <w:pStyle w:val="Heading2"/>
+      </w:pPr>
+      <w:r>
+        <w:t>20.6. Операторская панель: вкладка 'Назначения'</w:t>
+      </w:r>
+    </w:p>
+    <w:p>
+      <w:pPr>
+        <w:pStyle w:val="ListBullet"/>
+      </w:pPr>
+      <w:r>
+        <w:t>Левое окно сотрудников со сводкой по составу: всего активных, в работе, свободны, неактивны.</w:t>
+      </w:r>
+    </w:p>
+    <w:p>
+      <w:pPr>
+        <w:pStyle w:val="ListBullet"/>
+      </w:pPr>
+      <w:r>
+        <w:t>Правое окно дерева назначений по схеме этаж -&gt; отделение -&gt; помещение.</w:t>
+      </w:r>
+    </w:p>
+    <w:p>
+      <w:pPr>
+        <w:pStyle w:val="ListBullet"/>
+      </w:pPr>
+      <w:r>
+        <w:t>Чекбоксы на уровне этажа, отделения и помещения, включая частичное выделение.</w:t>
+      </w:r>
+    </w:p>
+    <w:p>
+      <w:pPr>
+        <w:pStyle w:val="ListBullet"/>
+      </w:pPr>
+      <w:r>
+        <w:t>Сводка по выбранному сотруднику: назначено, завершено, в работе, не начато.</w:t>
+      </w:r>
+    </w:p>
+    <w:p>
+      <w:pPr>
+        <w:pStyle w:val="ListBullet"/>
+      </w:pPr>
+      <w:r>
+        <w:t>Предупреждение о пересечении назначений, диалог объединения в группу и механика повторной проверки.</w:t>
+      </w:r>
+    </w:p>
+    <w:p>
+      <w:pPr>
+        <w:pStyle w:val="Heading2"/>
+      </w:pPr>
+      <w:r>
+        <w:t>20.7. Операторская панель: вкладки 'Группы' и 'Экспорт'</w:t>
+      </w:r>
+    </w:p>
+    <w:p>
+      <w:pPr>
+        <w:pStyle w:val="ListBullet"/>
+      </w:pPr>
+      <w:r>
+        <w:t>Вкладка 'Группы': список групп, краткая сводка по выбранной группе, участники и общий прогресс.</w:t>
+      </w:r>
+    </w:p>
+    <w:p>
+      <w:pPr>
+        <w:pStyle w:val="ListBullet"/>
+      </w:pPr>
+      <w:r>
+        <w:t>Вкладка 'Экспорт': таблица итоговых данных в формате, близком к будущему Excel-экспорту.</w:t>
+      </w:r>
+    </w:p>
+    <w:p>
+      <w:pPr>
+        <w:pStyle w:val="ListBullet"/>
+      </w:pPr>
+      <w:r>
+        <w:t>Фильтры по этажу, отделению, помещению, оборудованию, серийному номеру и статусу.</w:t>
+      </w:r>
+    </w:p>
+    <w:p>
+      <w:pPr>
+        <w:pStyle w:val="ListBullet"/>
+      </w:pPr>
+      <w:r>
+        <w:t>Колонки с датой проверки, ФИО сотрудника и текущими статусами по экземпляру.</w:t>
+      </w:r>
+    </w:p>
+    <w:p>
+      <w:pPr>
+        <w:pStyle w:val="Heading1"/>
+      </w:pPr>
+      <w:r>
+        <w:t>21. Основные страницы системы, права доступа и используемые модули</w:t>
+      </w:r>
+    </w:p>
+    <w:p>
+      <w:r>
+        <w:t>Ниже приведен перечень основных страниц и разделов системы с указанием их назначения, используемых функциональных модулей и ролей, которым должен предоставляться доступ.</w:t>
+      </w:r>
+    </w:p>
+    <w:p>
+      <w:pPr>
+        <w:pStyle w:val="Heading2"/>
+      </w:pPr>
+      <w:r>
+        <w:t>21.1. Страница входа в систему</w:t>
+      </w:r>
+    </w:p>
+    <w:p>
+      <w:pPr>
+        <w:pStyle w:val="ListBullet"/>
+      </w:pPr>
+      <w:r>
+        <w:t>Назначение: авторизация пользователя и определение набора доступных разделов по роли.</w:t>
+      </w:r>
+    </w:p>
+    <w:p>
+      <w:pPr>
+        <w:pStyle w:val="ListBullet"/>
+      </w:pPr>
+      <w:r>
+        <w:t>Используемые модули: модуль аутентификации, модуль ролевой модели, модуль валидации учетных данных.</w:t>
+      </w:r>
+    </w:p>
+    <w:p>
+      <w:pPr>
+        <w:pStyle w:val="ListBullet"/>
+      </w:pPr>
+      <w:r>
+        <w:t>Роли доступа: все пользователи системы.</w:t>
+      </w:r>
+    </w:p>
+    <w:p>
+      <w:pPr>
+        <w:pStyle w:val="Heading2"/>
+      </w:pPr>
+      <w:r>
+        <w:t>21.2. Личный кабинет пользователя</w:t>
+      </w:r>
+    </w:p>
+    <w:p>
+      <w:pPr>
+        <w:pStyle w:val="ListBullet"/>
+      </w:pPr>
+      <w:r>
+        <w:t>Назначение: просмотр и редактирование персональных данных, аватара, контактов и текущей роли.</w:t>
+      </w:r>
+    </w:p>
+    <w:p>
+      <w:pPr>
+        <w:pStyle w:val="ListBullet"/>
+      </w:pPr>
+      <w:r>
+        <w:t>Используемые модули: модуль профиля пользователя, модуль загрузки фото, модуль ролевых прав, модуль личной статистики.</w:t>
+      </w:r>
+    </w:p>
+    <w:p>
+      <w:pPr>
+        <w:pStyle w:val="ListBullet"/>
+      </w:pPr>
+      <w:r>
+        <w:t>Роли доступа: оператор, диспетчер, супервайзер.</w:t>
+      </w:r>
+    </w:p>
+    <w:p>
+      <w:pPr>
+        <w:pStyle w:val="Heading2"/>
+      </w:pPr>
+      <w:r>
+        <w:t>21.3. Мобильная страница 'Мои назначения'</w:t>
+      </w:r>
+    </w:p>
+    <w:p>
+      <w:pPr>
+        <w:pStyle w:val="ListBullet"/>
+      </w:pPr>
+      <w:r>
+        <w:t>Назначение: работа полевого сотрудника с назначенными помещениями и оборудованием.</w:t>
+      </w:r>
+    </w:p>
+    <w:p>
+      <w:pPr>
+        <w:pStyle w:val="ListBullet"/>
+      </w:pPr>
+      <w:r>
+        <w:t>Используемые модули: модуль назначений, модуль проверки помещений, модуль поэкземплярного учета, модуль повторной проверки, модуль офлайн-хранилища, модуль синхронизации.</w:t>
+      </w:r>
+    </w:p>
+    <w:p>
+      <w:pPr>
+        <w:pStyle w:val="ListBullet"/>
+      </w:pPr>
+      <w:r>
+        <w:t>Роли доступа: оператор.</w:t>
+      </w:r>
+    </w:p>
+    <w:p>
+      <w:pPr>
+        <w:pStyle w:val="Heading2"/>
+      </w:pPr>
+      <w:r>
+        <w:t>21.4. Операторская панель: страница 'Контроль'</w:t>
+      </w:r>
+    </w:p>
+    <w:p>
+      <w:pPr>
+        <w:pStyle w:val="ListBullet"/>
+      </w:pPr>
+      <w:r>
+        <w:t>Назначение: общий мониторинг хода работ, состояния помещений и проблемных экземпляров.</w:t>
+      </w:r>
+    </w:p>
+    <w:p>
+      <w:pPr>
+        <w:pStyle w:val="ListBullet"/>
+      </w:pPr>
+      <w:r>
+        <w:t>Используемые модули: модуль версий плана, модуль аналитики, модуль контроля помещений, модуль контроля экземпляров, модуль графиков, модуль фильтрации и поиска.</w:t>
+      </w:r>
+    </w:p>
+    <w:p>
+      <w:pPr>
+        <w:pStyle w:val="ListBullet"/>
+      </w:pPr>
+      <w:r>
+        <w:t>Роли доступа: диспетчер, супервайзер.</w:t>
+      </w:r>
+    </w:p>
+    <w:p>
+      <w:pPr>
+        <w:pStyle w:val="Heading2"/>
+      </w:pPr>
+      <w:r>
+        <w:t>21.5. Операторская панель: страница 'Сотрудники'</w:t>
+      </w:r>
+    </w:p>
+    <w:p>
+      <w:pPr>
+        <w:pStyle w:val="ListBullet"/>
+      </w:pPr>
+      <w:r>
+        <w:t>Назначение: создание, редактирование, отключение и восстановление сотрудников, назначение ролей, загрузка фотографий.</w:t>
+      </w:r>
+    </w:p>
+    <w:p>
+      <w:pPr>
+        <w:pStyle w:val="ListBullet"/>
+      </w:pPr>
+      <w:r>
+        <w:t>Используемые модули: модуль пользователей, модуль ролей, модуль валидации данных сотрудника, модуль загрузки фото.</w:t>
+      </w:r>
+    </w:p>
+    <w:p>
+      <w:pPr>
+        <w:pStyle w:val="ListBullet"/>
+      </w:pPr>
+      <w:r>
+        <w:t>Роли доступа: супервайзер.</w:t>
+      </w:r>
+    </w:p>
+    <w:p>
+      <w:pPr>
+        <w:pStyle w:val="Heading2"/>
+      </w:pPr>
+      <w:r>
+        <w:t>21.6. Операторская панель: страница 'Назначения'</w:t>
+      </w:r>
+    </w:p>
+    <w:p>
+      <w:pPr>
+        <w:pStyle w:val="ListBullet"/>
+      </w:pPr>
+      <w:r>
+        <w:t>Назначение: распределение этажей, отделений и помещений между сотрудниками, контроль прогресса по назначенным зонам.</w:t>
+      </w:r>
+    </w:p>
+    <w:p>
+      <w:pPr>
+        <w:pStyle w:val="ListBullet"/>
+      </w:pPr>
+      <w:r>
+        <w:t>Используемые модули: модуль назначений, модуль дерева помещений, модуль группировки сотрудников, модуль повторной проверки, модуль контроля пересечений назначений.</w:t>
+      </w:r>
+    </w:p>
+    <w:p>
+      <w:pPr>
+        <w:pStyle w:val="ListBullet"/>
+      </w:pPr>
+      <w:r>
+        <w:t>Роли доступа: диспетчер, супервайзер.</w:t>
+      </w:r>
+    </w:p>
+    <w:p>
+      <w:pPr>
+        <w:pStyle w:val="Heading2"/>
+      </w:pPr>
+      <w:r>
+        <w:t>21.7. Операторская панель: страница 'Группы'</w:t>
+      </w:r>
+    </w:p>
+    <w:p>
+      <w:pPr>
+        <w:pStyle w:val="ListBullet"/>
+      </w:pPr>
+      <w:r>
+        <w:t>Назначение: объединение сотрудников в группы и контроль общего прогресса группы.</w:t>
+      </w:r>
+    </w:p>
+    <w:p>
+      <w:pPr>
+        <w:pStyle w:val="ListBullet"/>
+      </w:pPr>
+      <w:r>
+        <w:t>Используемые модули: модуль групп сотрудников, модуль общих назначений, модуль агрегированного прогресса.</w:t>
+      </w:r>
+    </w:p>
+    <w:p>
+      <w:pPr>
+        <w:pStyle w:val="ListBullet"/>
+      </w:pPr>
+      <w:r>
+        <w:t>Роли доступа: диспетчер, супервайзер.</w:t>
+      </w:r>
+    </w:p>
+    <w:p>
+      <w:pPr>
+        <w:pStyle w:val="Heading2"/>
+      </w:pPr>
+      <w:r>
+        <w:t>21.8. Операторская панель: страница 'Экспорт'</w:t>
+      </w:r>
+    </w:p>
+    <w:p>
+      <w:pPr>
+        <w:pStyle w:val="ListBullet"/>
+      </w:pPr>
+      <w:r>
+        <w:t>Назначение: просмотр табличного представления итоговых данных и подготовка к выгрузке в Excel.</w:t>
+      </w:r>
+    </w:p>
+    <w:p>
+      <w:pPr>
+        <w:pStyle w:val="ListBullet"/>
+      </w:pPr>
+      <w:r>
+        <w:t>Используемые модули: модуль отчетности, модуль экспорта Excel, модуль фильтрации, модуль табличного представления экземпляров.</w:t>
+      </w:r>
+    </w:p>
+    <w:p>
+      <w:pPr>
+        <w:pStyle w:val="ListBullet"/>
+      </w:pPr>
+      <w:r>
+        <w:t>Роли доступа: диспетчер, супервайзер.</w:t>
+      </w:r>
+    </w:p>
+    <w:p>
+      <w:pPr>
+        <w:pStyle w:val="Heading2"/>
+      </w:pPr>
+      <w:r>
+        <w:t>21.9. Складские страницы и операции</w:t>
+      </w:r>
+    </w:p>
+    <w:p>
+      <w:pPr>
+        <w:pStyle w:val="ListBullet"/>
+      </w:pPr>
+      <w:r>
+        <w:t>Назначение: работа с поступлениями, складскими зонами, подтверждениями приемки и перемещениями оборудования.</w:t>
+      </w:r>
+    </w:p>
+    <w:p>
+      <w:pPr>
+        <w:pStyle w:val="ListBullet"/>
+      </w:pPr>
+      <w:r>
+        <w:t>Используемые модули: модуль складов, модуль поступлений, модуль подтверждений приемки, модуль перемещений, модуль остатков.</w:t>
+      </w:r>
+    </w:p>
+    <w:p>
+      <w:pPr>
+        <w:pStyle w:val="ListBullet"/>
+      </w:pPr>
+      <w:r>
+        <w:t>Роли доступа: диспетчер, супервайзер. Для подтверждения приемки отдельные операции доступны оператору в полевом интерфейсе.</w:t>
+      </w:r>
+    </w:p>
+    <w:p>
+      <w:pPr>
+        <w:pStyle w:val="Heading2"/>
+      </w:pPr>
+      <w:r>
+        <w:t>21.10. Журналы и конфликты</w:t>
+      </w:r>
+    </w:p>
+    <w:p>
+      <w:pPr>
+        <w:pStyle w:val="ListBullet"/>
+      </w:pPr>
+      <w:r>
+        <w:t>Назначение: просмотр истории действий, расхождений, конфликтов и результатов повторных проверок.</w:t>
+      </w:r>
+    </w:p>
+    <w:p>
+      <w:pPr>
+        <w:pStyle w:val="ListBullet"/>
+      </w:pPr>
+      <w:r>
+        <w:t>Используемые модули: модуль событий, модуль аудита, модуль конфликтов, модуль повторных проверок.</w:t>
+      </w:r>
+    </w:p>
+    <w:p>
+      <w:pPr>
+        <w:pStyle w:val="ListBullet"/>
+      </w:pPr>
+      <w:r>
+        <w:t>Роли доступа: диспетчер, супервайзер.</w:t>
+      </w:r>
+    </w:p>
+    <w:p>
+      <w:pPr>
+        <w:pStyle w:val="Heading1"/>
+      </w:pPr>
+      <w:r>
+        <w:t>22. Используемые инструменты и обоснование выбора</w:t>
       </w:r>
     </w:p>
     <w:p>
@@ -1703,6 +2369,363 @@
       </w:pPr>
       <w:r>
         <w:t>Локальный сервер заказчика: среда размещения системы. Выбран для соблюдения требования о локальной обработке данных, независимости от внешнего интернета и управляемости инфраструктуры на объекте.</w:t>
+      </w:r>
+    </w:p>
+    <w:p>
+      <w:pPr>
+        <w:pStyle w:val="Heading1"/>
+      </w:pPr>
+      <w:r>
+        <w:t>23. Дополнение: приемка, склады и перемещения по новой логике</w:t>
+      </w:r>
+    </w:p>
+    <w:p>
+      <w:r>
+        <w:t>Настоящий раздел уточняет и дополняет базовую модель учета оборудования. Приоритетной логикой системы считается приемка оборудования на объект по строкам поступления и количеству, хранение по складским зонам и помещениям, а также последующее создание поэкземплярного учета только в момент размещения оборудования в целевых помещениях.</w:t>
+      </w:r>
+    </w:p>
+    <w:p>
+      <w:pPr>
+        <w:pStyle w:val="Heading2"/>
+      </w:pPr>
+      <w:r>
+        <w:t>23.1. Единицы учета на разных этапах</w:t>
+      </w:r>
+    </w:p>
+    <w:p>
+      <w:pPr>
+        <w:pStyle w:val="ListBullet"/>
+      </w:pPr>
+      <w:r>
+        <w:t>На этапе поступления оборудование учитывается по строке поступления: шифр (позиция), наименование, сопроводительная информация и количество.</w:t>
+      </w:r>
+    </w:p>
+    <w:p>
+      <w:pPr>
+        <w:pStyle w:val="ListBullet"/>
+      </w:pPr>
+      <w:r>
+        <w:t>До размещения в помещение оборудование на складе не развертывается в экземпляры.</w:t>
+      </w:r>
+    </w:p>
+    <w:p>
+      <w:pPr>
+        <w:pStyle w:val="ListBullet"/>
+      </w:pPr>
+      <w:r>
+        <w:t>Экземпляры создаются только в момент перемещения оборудования в помещения, так как именно на этом этапе требуется поэкземплярный ввод серийных номеров.</w:t>
+      </w:r>
+    </w:p>
+    <w:p>
+      <w:pPr>
+        <w:pStyle w:val="ListBullet"/>
+      </w:pPr>
+      <w:r>
+        <w:t>Серийные номера вводятся только при размещении оборудования в помещения.</w:t>
+      </w:r>
+    </w:p>
+    <w:p>
+      <w:pPr>
+        <w:pStyle w:val="Heading2"/>
+      </w:pPr>
+      <w:r>
+        <w:t>23.2. Приемка оборудования на объект</w:t>
+      </w:r>
+    </w:p>
+    <w:p>
+      <w:pPr>
+        <w:pStyle w:val="ListBullet"/>
+      </w:pPr>
+      <w:r>
+        <w:t>Сотрудник на объекте принимает оборудование по строкам поступления и количеству.</w:t>
+      </w:r>
+    </w:p>
+    <w:p>
+      <w:pPr>
+        <w:pStyle w:val="ListBullet"/>
+      </w:pPr>
+      <w:r>
+        <w:t>По каждой строке поступления обязательно фиксируются: фактическое количество, состояние, фото и комментарий при необходимости.</w:t>
+      </w:r>
+    </w:p>
+    <w:p>
+      <w:pPr>
+        <w:pStyle w:val="ListBullet"/>
+      </w:pPr>
+      <w:r>
+        <w:t>Приемка считается завершенной, когда подтверждены количество и состояние.</w:t>
+      </w:r>
+    </w:p>
+    <w:p>
+      <w:pPr>
+        <w:pStyle w:val="ListBullet"/>
+      </w:pPr>
+      <w:r>
+        <w:t>Если для поступления не выбрана конкретная физическая складская зона, оборудование должно переходить в статус 'ожидает размещения'.</w:t>
+      </w:r>
+    </w:p>
+    <w:p>
+      <w:pPr>
+        <w:pStyle w:val="ListBullet"/>
+      </w:pPr>
+      <w:r>
+        <w:t>Система должна поддерживать приемку всего поступления на временный склад, дробление поступления между несколькими складами, а также частичное прямое размещение по помещениям.</w:t>
+      </w:r>
+    </w:p>
+    <w:p>
+      <w:pPr>
+        <w:pStyle w:val="Heading2"/>
+      </w:pPr>
+      <w:r>
+        <w:t>23.3. Недостача, излишки и внеплановые позиции</w:t>
+      </w:r>
+    </w:p>
+    <w:p>
+      <w:pPr>
+        <w:pStyle w:val="ListBullet"/>
+      </w:pPr>
+      <w:r>
+        <w:t>Если фактическое количество меньше заявленного, система должна одновременно фиксировать недостачу, создавать конфликт и формировать задачу на допоставку.</w:t>
+      </w:r>
+    </w:p>
+    <w:p>
+      <w:pPr>
+        <w:pStyle w:val="ListBullet"/>
+      </w:pPr>
+      <w:r>
+        <w:t>Если фактическое количество больше заявленного, превышение должно автоматически переводиться в виртуальный склад 'Излишки'.</w:t>
+      </w:r>
+    </w:p>
+    <w:p>
+      <w:pPr>
+        <w:pStyle w:val="ListBullet"/>
+      </w:pPr>
+      <w:r>
+        <w:t>Если поступила позиция, которой нет в плане, она также должна переводиться в виртуальный склад 'Излишки'.</w:t>
+      </w:r>
+    </w:p>
+    <w:p>
+      <w:pPr>
+        <w:pStyle w:val="ListBullet"/>
+      </w:pPr>
+      <w:r>
+        <w:t>Для виртуального склада 'Излишки' обязательно хранить: позицию (шифр), наименование, количество, текущее место хранения (склад или помещение), фото и комментарии.</w:t>
+      </w:r>
+    </w:p>
+    <w:p>
+      <w:pPr>
+        <w:pStyle w:val="ListBullet"/>
+      </w:pPr>
+      <w:r>
+        <w:t>Для спорных или поврежденных партий дополнительно должна поддерживаться виртуальная зона 'Карантин'.</w:t>
+      </w:r>
+    </w:p>
+    <w:p>
+      <w:pPr>
+        <w:pStyle w:val="ListBullet"/>
+      </w:pPr>
+      <w:r>
+        <w:t>Создание и подтверждение операций по внеплановым позициям и излишкам должно быть доступно диспетчеру и супервайзеру; полевой оператор может инициировать фиксацию факта на объекте только в пределах доступного сценария.</w:t>
+      </w:r>
+    </w:p>
+    <w:p>
+      <w:pPr>
+        <w:pStyle w:val="Heading2"/>
+      </w:pPr>
+      <w:r>
+        <w:t>23.4. Складские зоны и помещения</w:t>
+      </w:r>
+    </w:p>
+    <w:p>
+      <w:pPr>
+        <w:pStyle w:val="ListBullet"/>
+      </w:pPr>
+      <w:r>
+        <w:t>Любое помещение внутри объекта может быть использовано как складская зона.</w:t>
+      </w:r>
+    </w:p>
+    <w:p>
+      <w:pPr>
+        <w:pStyle w:val="ListBullet"/>
+      </w:pPr>
+      <w:r>
+        <w:t>Складская зона должна поддерживать тип: физическая, виртуальная 'Излишки', виртуальная 'Ожидает размещения', виртуальная 'Карантин'.</w:t>
+      </w:r>
+    </w:p>
+    <w:p>
+      <w:pPr>
+        <w:pStyle w:val="ListBullet"/>
+      </w:pPr>
+      <w:r>
+        <w:t>На складе оборудование учитывается как позиция (шифр), наименование, прочая информация и количество.</w:t>
+      </w:r>
+    </w:p>
+    <w:p>
+      <w:pPr>
+        <w:pStyle w:val="ListBullet"/>
+      </w:pPr>
+      <w:r>
+        <w:t>Проблемные позиции, поврежденное оборудование и спорные размещения должны отображаться в конфликтах, но не блокировать сам факт перемещения.</w:t>
+      </w:r>
+    </w:p>
+    <w:p>
+      <w:pPr>
+        <w:pStyle w:val="Heading2"/>
+      </w:pPr>
+      <w:r>
+        <w:t>23.5. Перемещения</w:t>
+      </w:r>
+    </w:p>
+    <w:p>
+      <w:pPr>
+        <w:pStyle w:val="ListBullet"/>
+      </w:pPr>
+      <w:r>
+        <w:t>Система должна поддерживать перемещения: склад -&gt; склад, склад -&gt; помещение, помещение -&gt; склад, помещение -&gt; помещение, а также поступление -&gt; помещение напрямую.</w:t>
+      </w:r>
+    </w:p>
+    <w:p>
+      <w:pPr>
+        <w:pStyle w:val="ListBullet"/>
+      </w:pPr>
+      <w:r>
+        <w:t>При создании перемещения оборудование должно сразу списываться из исходной точки учета.</w:t>
+      </w:r>
+    </w:p>
+    <w:p>
+      <w:pPr>
+        <w:pStyle w:val="ListBullet"/>
+      </w:pPr>
+      <w:r>
+        <w:t>Любое перемещение требует подтверждения диспетчером или супервайзером.</w:t>
+      </w:r>
+    </w:p>
+    <w:p>
+      <w:pPr>
+        <w:pStyle w:val="ListBullet"/>
+      </w:pPr>
+      <w:r>
+        <w:t>Если перемещение отменяется, оно должно попадать в конфликт и далее может быть: подтверждено, изменено или окончательно отменено с возвратом оборудования на исходный склад.</w:t>
+      </w:r>
+    </w:p>
+    <w:p>
+      <w:pPr>
+        <w:pStyle w:val="ListBullet"/>
+      </w:pPr>
+      <w:r>
+        <w:t>В истории должны сохраняться все стадии: создание перемещения, подтверждение, изменение, отмена, возврат.</w:t>
+      </w:r>
+    </w:p>
+    <w:p>
+      <w:pPr>
+        <w:pStyle w:val="ListBullet"/>
+      </w:pPr>
+      <w:r>
+        <w:t>Оборудование не должно дублироваться в нескольких местах одновременно.</w:t>
+      </w:r>
+    </w:p>
+    <w:p>
+      <w:pPr>
+        <w:pStyle w:val="Heading2"/>
+      </w:pPr>
+      <w:r>
+        <w:t>23.6. Подтверждение размещения по помещениям</w:t>
+      </w:r>
+    </w:p>
+    <w:p>
+      <w:pPr>
+        <w:pStyle w:val="ListBullet"/>
+      </w:pPr>
+      <w:r>
+        <w:t>Подтверждение размещения в помещении выполняется после складского перемещения или прямого поступления.</w:t>
+      </w:r>
+    </w:p>
+    <w:p>
+      <w:pPr>
+        <w:pStyle w:val="ListBullet"/>
+      </w:pPr>
+      <w:r>
+        <w:t>Именно на этапе размещения в помещение создаются экземпляры оборудования: экземпляр 1, экземпляр 2, экземпляр 3 и т.д.</w:t>
+      </w:r>
+    </w:p>
+    <w:p>
+      <w:pPr>
+        <w:pStyle w:val="ListBullet"/>
+      </w:pPr>
+      <w:r>
+        <w:t>По каждому созданному экземпляру вводятся серийный номер, ПНР, коммуникации, фото и комментарии.</w:t>
+      </w:r>
+    </w:p>
+    <w:p>
+      <w:pPr>
+        <w:pStyle w:val="ListBullet"/>
+      </w:pPr>
+      <w:r>
+        <w:t>Если при размещении или инвентаризации оборудование найдено не в том помещении или не в той складской зоне, система должна создавать конфликт с историей перемещений по позиции.</w:t>
+      </w:r>
+    </w:p>
+    <w:p>
+      <w:pPr>
+        <w:pStyle w:val="Heading2"/>
+      </w:pPr>
+      <w:r>
+        <w:t>23.7. Инвентаризация складов</w:t>
+      </w:r>
+    </w:p>
+    <w:p>
+      <w:pPr>
+        <w:pStyle w:val="ListBullet"/>
+      </w:pPr>
+      <w:r>
+        <w:t>Система должна поддерживать отдельный сценарий инвентаризации складских помещений.</w:t>
+      </w:r>
+    </w:p>
+    <w:p>
+      <w:pPr>
+        <w:pStyle w:val="ListBullet"/>
+      </w:pPr>
+      <w:r>
+        <w:t>Инвентаризация склада должна уметь выдаваться как назначение сотруднику.</w:t>
+      </w:r>
+    </w:p>
+    <w:p>
+      <w:pPr>
+        <w:pStyle w:val="ListBullet"/>
+      </w:pPr>
+      <w:r>
+        <w:t>По итогам инвентаризации склада должны фиксироваться расхождения, конфликты, излишки и недостачи.</w:t>
+      </w:r>
+    </w:p>
+    <w:p>
+      <w:pPr>
+        <w:pStyle w:val="Heading2"/>
+      </w:pPr>
+      <w:r>
+        <w:t>23.8. Роли и переключение рабочих контуров</w:t>
+      </w:r>
+    </w:p>
+    <w:p>
+      <w:pPr>
+        <w:pStyle w:val="ListBullet"/>
+      </w:pPr>
+      <w:r>
+        <w:t>Роли системы фиксируются как: operator (полевой оператор), dispetcher (диспетчер), admin (супервайзер).</w:t>
+      </w:r>
+    </w:p>
+    <w:p>
+      <w:pPr>
+        <w:pStyle w:val="ListBullet"/>
+      </w:pPr>
+      <w:r>
+        <w:t>Один и тот же физический сотрудник может иметь доступ в разных ролях, если это разрешено администратором.</w:t>
+      </w:r>
+    </w:p>
+    <w:p>
+      <w:pPr>
+        <w:pStyle w:val="ListBullet"/>
+      </w:pPr>
+      <w:r>
+        <w:t>Если сотруднику разрешены разные роли, он должен иметь возможность переключать роль внутри профиля и видеть только тот интерфейс, который соответствует активной роли.</w:t>
       </w:r>
     </w:p>
     <w:p>

</xml_diff>